<commit_message>
Update Lab info & email
</commit_message>
<xml_diff>
--- a/site/public/assets/research-reflection-questionnaire-en.docx
+++ b/site/public/assets/research-reflection-questionnaire-en.docx
@@ -44,7 +44,7 @@
           <w:sz w:val="20"/>
           <w:szCs w:val="20"/>
         </w:rPr>
-        <w:t xml:space="preserve">For the thinking prompts under each question, writing guidelines, and the policy on AI tools, see the "Research Reflection Questionnaire" page on the website. One to three paragraphs is enough for most questions; extend the space as needed. When finished, convert this document to PDF and attach it to your application email.</w:t>
+        <w:t xml:space="preserve">For the thinking prompts under each question, writing guidelines, and the policy on AI tools, see the "Research Reflection Questionnaire" page on the website. Five to ten sentences is enough for most questions; extend the space as needed. When finished, convert this document to PDF and attach it to your application email.</w:t>
       </w:r>
     </w:p>
     <w:p>
@@ -89,7 +89,7 @@
           <w:sz w:val="22"/>
           <w:szCs w:val="22"/>
         </w:rPr>
-        <w:t xml:space="preserve">Role you are applying for (undergraduate project student / research assistant / MS student / PhD student):</w:t>
+        <w:t xml:space="preserve">The role you are applying for: undergraduate project student, research assistant, master's student, or PhD student:</w:t>
       </w:r>
     </w:p>
     <w:p>
@@ -105,7 +105,7 @@
           <w:sz w:val="22"/>
           <w:szCs w:val="22"/>
         </w:rPr>
-        <w:t xml:space="preserve">Current school, department, and year, or current occupation:</w:t>
+        <w:t xml:space="preserve">Your current school, department, and year, or your current occupation:</w:t>
       </w:r>
     </w:p>
     <w:p>
@@ -121,7 +121,7 @@
           <w:sz w:val="22"/>
           <w:szCs w:val="22"/>
         </w:rPr>
-        <w:t xml:space="preserve">Intended start date / collaboration period:</w:t>
+        <w:t xml:space="preserve">Your intended start date / collaboration period:</w:t>
       </w:r>
     </w:p>
     <w:p>
@@ -137,7 +137,7 @@
           <w:sz w:val="22"/>
           <w:szCs w:val="22"/>
         </w:rPr>
-        <w:t xml:space="preserve">Approximate time you can reliably commit per week:</w:t>
+        <w:t xml:space="preserve">Roughly how much time per week you can reliably commit:</w:t>
       </w:r>
     </w:p>
     <w:p>
@@ -153,7 +153,7 @@
           <w:sz w:val="22"/>
           <w:szCs w:val="22"/>
         </w:rPr>
-        <w:t xml:space="preserve">Concrete timeline goals (capstone, graduation, MS/PhD application, job, etc.), if any:</w:t>
+        <w:t xml:space="preserve">Whether you have a capstone project, graduation, graduate school (MS/PhD) application, job, or other concrete timeline goals:</w:t>
       </w:r>
     </w:p>
     <w:p>
@@ -189,7 +189,7 @@
     <w:p>
       <w:pPr>
         <w:pBdr>
-          <w:bottom w:val="single" w:color="BFBFBF" w:sz="2" w:space="12"/>
+          <w:bottom w:val="single" w:color="BFBFBF" w:sz="2" w:space="6"/>
         </w:pBdr>
         <w:spacing w:after="360"/>
       </w:pPr>
@@ -220,7 +220,7 @@
     <w:p>
       <w:pPr>
         <w:pBdr>
-          <w:bottom w:val="single" w:color="BFBFBF" w:sz="2" w:space="12"/>
+          <w:bottom w:val="single" w:color="BFBFBF" w:sz="2" w:space="6"/>
         </w:pBdr>
         <w:spacing w:after="360"/>
       </w:pPr>
@@ -251,38 +251,38 @@
     <w:p>
       <w:pPr>
         <w:pBdr>
-          <w:bottom w:val="single" w:color="BFBFBF" w:sz="2" w:space="12"/>
-        </w:pBdr>
-        <w:spacing w:after="360"/>
-      </w:pPr>
-      <w:r>
-        <w:rPr>
-          <w:rFonts w:ascii="Calibri" w:cs="Calibri" w:eastAsia="Calibri" w:hAnsi="Calibri"/>
-          <w:sz w:val="22"/>
-          <w:szCs w:val="22"/>
-        </w:rPr>
-        <w:t xml:space="preserve"/>
-      </w:r>
-    </w:p>
-    <w:p>
-      <w:pPr>
-        <w:spacing w:after="160"/>
-      </w:pPr>
-      <w:r>
-        <w:rPr>
-          <w:rFonts w:ascii="Calibri" w:cs="Calibri" w:eastAsia="Calibri" w:hAnsi="Calibri"/>
-          <w:b/>
-          <w:bCs/>
-          <w:sz w:val="22"/>
-          <w:szCs w:val="22"/>
-        </w:rPr>
-        <w:t xml:space="preserve">4. When you run into a problem you don't know how to solve, how do you usually start? (Please use a concrete example.)</w:t>
-      </w:r>
-    </w:p>
-    <w:p>
-      <w:pPr>
-        <w:pBdr>
-          <w:bottom w:val="single" w:color="BFBFBF" w:sz="2" w:space="12"/>
+          <w:bottom w:val="single" w:color="BFBFBF" w:sz="2" w:space="6"/>
+        </w:pBdr>
+        <w:spacing w:after="360"/>
+      </w:pPr>
+      <w:r>
+        <w:rPr>
+          <w:rFonts w:ascii="Calibri" w:cs="Calibri" w:eastAsia="Calibri" w:hAnsi="Calibri"/>
+          <w:sz w:val="22"/>
+          <w:szCs w:val="22"/>
+        </w:rPr>
+        <w:t xml:space="preserve"/>
+      </w:r>
+    </w:p>
+    <w:p>
+      <w:pPr>
+        <w:spacing w:after="160"/>
+      </w:pPr>
+      <w:r>
+        <w:rPr>
+          <w:rFonts w:ascii="Calibri" w:cs="Calibri" w:eastAsia="Calibri" w:hAnsi="Calibri"/>
+          <w:b/>
+          <w:bCs/>
+          <w:sz w:val="22"/>
+          <w:szCs w:val="22"/>
+        </w:rPr>
+        <w:t xml:space="preserve">4. When you run into a problem you don't know how to solve, how do you usually start?</w:t>
+      </w:r>
+    </w:p>
+    <w:p>
+      <w:pPr>
+        <w:pBdr>
+          <w:bottom w:val="single" w:color="BFBFBF" w:sz="2" w:space="6"/>
         </w:pBdr>
         <w:spacing w:after="360"/>
       </w:pPr>
@@ -313,38 +313,38 @@
     <w:p>
       <w:pPr>
         <w:pBdr>
-          <w:bottom w:val="single" w:color="BFBFBF" w:sz="2" w:space="12"/>
-        </w:pBdr>
-        <w:spacing w:after="360"/>
-      </w:pPr>
-      <w:r>
-        <w:rPr>
-          <w:rFonts w:ascii="Calibri" w:cs="Calibri" w:eastAsia="Calibri" w:hAnsi="Calibri"/>
-          <w:sz w:val="22"/>
-          <w:szCs w:val="22"/>
-        </w:rPr>
-        <w:t xml:space="preserve"/>
-      </w:r>
-    </w:p>
-    <w:p>
-      <w:pPr>
-        <w:spacing w:after="160"/>
-      </w:pPr>
-      <w:r>
-        <w:rPr>
-          <w:rFonts w:ascii="Calibri" w:cs="Calibri" w:eastAsia="Calibri" w:hAnsi="Calibri"/>
-          <w:b/>
-          <w:bCs/>
-          <w:sz w:val="22"/>
-          <w:szCs w:val="22"/>
-        </w:rPr>
-        <w:t xml:space="preserve">6. Choose one paper from this lab that interests you, and tell me your understanding of it and why you're interested. (Please read at least one of the lab's papers or related research.)</w:t>
-      </w:r>
-    </w:p>
-    <w:p>
-      <w:pPr>
-        <w:pBdr>
-          <w:bottom w:val="single" w:color="BFBFBF" w:sz="2" w:space="12"/>
+          <w:bottom w:val="single" w:color="BFBFBF" w:sz="2" w:space="6"/>
+        </w:pBdr>
+        <w:spacing w:after="360"/>
+      </w:pPr>
+      <w:r>
+        <w:rPr>
+          <w:rFonts w:ascii="Calibri" w:cs="Calibri" w:eastAsia="Calibri" w:hAnsi="Calibri"/>
+          <w:sz w:val="22"/>
+          <w:szCs w:val="22"/>
+        </w:rPr>
+        <w:t xml:space="preserve"/>
+      </w:r>
+    </w:p>
+    <w:p>
+      <w:pPr>
+        <w:spacing w:after="160"/>
+      </w:pPr>
+      <w:r>
+        <w:rPr>
+          <w:rFonts w:ascii="Calibri" w:cs="Calibri" w:eastAsia="Calibri" w:hAnsi="Calibri"/>
+          <w:b/>
+          <w:bCs/>
+          <w:sz w:val="22"/>
+          <w:szCs w:val="22"/>
+        </w:rPr>
+        <w:t xml:space="preserve">6. Choose one paper from this lab that interests you, and tell me your understanding of it and why you're interested.</w:t>
+      </w:r>
+    </w:p>
+    <w:p>
+      <w:pPr>
+        <w:pBdr>
+          <w:bottom w:val="single" w:color="BFBFBF" w:sz="2" w:space="6"/>
         </w:pBdr>
         <w:spacing w:after="360"/>
       </w:pPr>
@@ -375,7 +375,7 @@
     <w:p>
       <w:pPr>
         <w:pBdr>
-          <w:bottom w:val="single" w:color="BFBFBF" w:sz="2" w:space="12"/>
+          <w:bottom w:val="single" w:color="BFBFBF" w:sz="2" w:space="6"/>
         </w:pBdr>
         <w:spacing w:after="360"/>
       </w:pPr>
@@ -406,69 +406,69 @@
     <w:p>
       <w:pPr>
         <w:pBdr>
-          <w:bottom w:val="single" w:color="BFBFBF" w:sz="2" w:space="12"/>
-        </w:pBdr>
-        <w:spacing w:after="360"/>
-      </w:pPr>
-      <w:r>
-        <w:rPr>
-          <w:rFonts w:ascii="Calibri" w:cs="Calibri" w:eastAsia="Calibri" w:hAnsi="Calibri"/>
-          <w:sz w:val="22"/>
-          <w:szCs w:val="22"/>
-        </w:rPr>
-        <w:t xml:space="preserve"/>
-      </w:r>
-    </w:p>
-    <w:p>
-      <w:pPr>
-        <w:spacing w:after="160"/>
-      </w:pPr>
-      <w:r>
-        <w:rPr>
-          <w:rFonts w:ascii="Calibri" w:cs="Calibri" w:eastAsia="Calibri" w:hAnsi="Calibri"/>
-          <w:b/>
-          <w:bCs/>
-          <w:sz w:val="22"/>
-          <w:szCs w:val="22"/>
-        </w:rPr>
-        <w:t xml:space="preserve">9. When you disagree with the judgment of a teacher, mentor, or team member, how do you usually handle it? (Please use a concrete example.)</w:t>
-      </w:r>
-    </w:p>
-    <w:p>
-      <w:pPr>
-        <w:pBdr>
-          <w:bottom w:val="single" w:color="BFBFBF" w:sz="2" w:space="12"/>
-        </w:pBdr>
-        <w:spacing w:after="360"/>
-      </w:pPr>
-      <w:r>
-        <w:rPr>
-          <w:rFonts w:ascii="Calibri" w:cs="Calibri" w:eastAsia="Calibri" w:hAnsi="Calibri"/>
-          <w:sz w:val="22"/>
-          <w:szCs w:val="22"/>
-        </w:rPr>
-        <w:t xml:space="preserve"/>
-      </w:r>
-    </w:p>
-    <w:p>
-      <w:pPr>
-        <w:spacing w:after="160"/>
-      </w:pPr>
-      <w:r>
-        <w:rPr>
-          <w:rFonts w:ascii="Calibri" w:cs="Calibri" w:eastAsia="Calibri" w:hAnsi="Calibri"/>
-          <w:b/>
-          <w:bCs/>
-          <w:sz w:val="22"/>
-          <w:szCs w:val="22"/>
-        </w:rPr>
-        <w:t xml:space="preserve">10. After reading "How We Do Research" on the website, which parts made you feel this might suit you? Which parts made you hesitant, concerned, or wanting to confirm further?</w:t>
-      </w:r>
-    </w:p>
-    <w:p>
-      <w:pPr>
-        <w:pBdr>
-          <w:bottom w:val="single" w:color="BFBFBF" w:sz="2" w:space="12"/>
+          <w:bottom w:val="single" w:color="BFBFBF" w:sz="2" w:space="6"/>
+        </w:pBdr>
+        <w:spacing w:after="360"/>
+      </w:pPr>
+      <w:r>
+        <w:rPr>
+          <w:rFonts w:ascii="Calibri" w:cs="Calibri" w:eastAsia="Calibri" w:hAnsi="Calibri"/>
+          <w:sz w:val="22"/>
+          <w:szCs w:val="22"/>
+        </w:rPr>
+        <w:t xml:space="preserve"/>
+      </w:r>
+    </w:p>
+    <w:p>
+      <w:pPr>
+        <w:spacing w:after="160"/>
+      </w:pPr>
+      <w:r>
+        <w:rPr>
+          <w:rFonts w:ascii="Calibri" w:cs="Calibri" w:eastAsia="Calibri" w:hAnsi="Calibri"/>
+          <w:b/>
+          <w:bCs/>
+          <w:sz w:val="22"/>
+          <w:szCs w:val="22"/>
+        </w:rPr>
+        <w:t xml:space="preserve">9. When you disagree with the judgment of a teacher, mentor, or team member, how do you usually handle it?</w:t>
+      </w:r>
+    </w:p>
+    <w:p>
+      <w:pPr>
+        <w:pBdr>
+          <w:bottom w:val="single" w:color="BFBFBF" w:sz="2" w:space="6"/>
+        </w:pBdr>
+        <w:spacing w:after="360"/>
+      </w:pPr>
+      <w:r>
+        <w:rPr>
+          <w:rFonts w:ascii="Calibri" w:cs="Calibri" w:eastAsia="Calibri" w:hAnsi="Calibri"/>
+          <w:sz w:val="22"/>
+          <w:szCs w:val="22"/>
+        </w:rPr>
+        <w:t xml:space="preserve"/>
+      </w:r>
+    </w:p>
+    <w:p>
+      <w:pPr>
+        <w:spacing w:after="160"/>
+      </w:pPr>
+      <w:r>
+        <w:rPr>
+          <w:rFonts w:ascii="Calibri" w:cs="Calibri" w:eastAsia="Calibri" w:hAnsi="Calibri"/>
+          <w:b/>
+          <w:bCs/>
+          <w:sz w:val="22"/>
+          <w:szCs w:val="22"/>
+        </w:rPr>
+        <w:t xml:space="preserve">10. After reading How We Do Research, which parts made you feel this might suit you? Which parts made you hesitant, concerned, or wanting to confirm further?</w:t>
+      </w:r>
+    </w:p>
+    <w:p>
+      <w:pPr>
+        <w:pBdr>
+          <w:bottom w:val="single" w:color="BFBFBF" w:sz="2" w:space="6"/>
         </w:pBdr>
         <w:spacing w:after="360"/>
       </w:pPr>

</xml_diff>